<commit_message>
Update instructor guide document
</commit_message>
<xml_diff>
--- a/docs/MMMF_Instructor_Guide.docx
+++ b/docs/MMMF_Instructor_Guide.docx
@@ -3862,8 +3862,8 @@
         <w:tblLook w:val="0000" w:firstRow="0" w:lastRow="0" w:firstColumn="0" w:lastColumn="0" w:noHBand="0" w:noVBand="0"/>
       </w:tblPr>
       <w:tblGrid>
-        <w:gridCol w:w="3120"/>
-        <w:gridCol w:w="6240"/>
+        <w:gridCol w:w="3733"/>
+        <w:gridCol w:w="5627"/>
       </w:tblGrid>
       <w:tr>
         <w:tblPrEx>
@@ -3999,6 +3999,11 @@
           <w:p>
             <w:pPr>
               <w:spacing w:before="40" w:after="40"/>
+              <w:rPr>
+                <w:color w:val="333333"/>
+                <w:sz w:val="20"/>
+                <w:szCs w:val="20"/>
+              </w:rPr>
             </w:pPr>
             <w:r>
               <w:rPr>
@@ -4008,6 +4013,29 @@
               </w:rPr>
               <w:t>Administer Pre-Course Collaborative for Academic, Social, and Emotional Learning (CASEL) Survey</w:t>
             </w:r>
+            <w:r>
+              <w:rPr>
+                <w:color w:val="333333"/>
+                <w:sz w:val="20"/>
+                <w:szCs w:val="20"/>
+              </w:rPr>
+              <w:t xml:space="preserve"> </w:t>
+            </w:r>
+            <w:hyperlink r:id="rId16" w:history="1">
+              <w:r>
+                <w:rPr>
+                  <w:rStyle w:val="Hyperlink"/>
+                  <w:sz w:val="20"/>
+                  <w:szCs w:val="20"/>
+                </w:rPr>
+                <w:t>https://readyforreallife.github.io/mmmf-codex/docs/index.html</w:t>
+              </w:r>
+            </w:hyperlink>
+          </w:p>
+          <w:p>
+            <w:pPr>
+              <w:spacing w:before="40" w:after="40"/>
+            </w:pPr>
           </w:p>
         </w:tc>
         <w:tc>
@@ -4793,6 +4821,7 @@
                 <w:sz w:val="20"/>
                 <w:szCs w:val="20"/>
               </w:rPr>
+              <w:lastRenderedPageBreak/>
               <w:t>Mini-lesson</w:t>
             </w:r>
             <w:proofErr w:type="gramEnd"/>
@@ -4896,7 +4925,6 @@
                 <w:sz w:val="20"/>
                 <w:szCs w:val="20"/>
               </w:rPr>
-              <w:lastRenderedPageBreak/>
               <w:t>Introduce active listening sentence stems</w:t>
             </w:r>
           </w:p>
@@ -6046,6 +6074,7 @@
               <w:rPr>
                 <w:color w:val="333333"/>
               </w:rPr>
+              <w:lastRenderedPageBreak/>
               <w:t>Reflection Journal #3 - kept in workbook</w:t>
             </w:r>
           </w:p>
@@ -6112,7 +6141,6 @@
                 <w:sz w:val="24"/>
                 <w:szCs w:val="24"/>
               </w:rPr>
-              <w:lastRenderedPageBreak/>
               <w:t>WEEK 4: Manners Challenge + Group Discussion (MILESTONE WEEK)</w:t>
             </w:r>
           </w:p>
@@ -7251,6 +7279,7 @@
                 <w:sz w:val="20"/>
                 <w:szCs w:val="20"/>
               </w:rPr>
+              <w:lastRenderedPageBreak/>
               <w:t>Model Pause-Label-Reframe-Respond (PLRR) out loud with a real scenario</w:t>
             </w:r>
           </w:p>
@@ -7345,7 +7374,6 @@
                 <w:sz w:val="20"/>
                 <w:szCs w:val="20"/>
               </w:rPr>
-              <w:lastRenderedPageBreak/>
               <w:t>Pair practice: walk through Pause-Label-Reframe-Respond (PLRR) with partner</w:t>
             </w:r>
           </w:p>
@@ -8431,6 +8459,7 @@
                 <w:sz w:val="24"/>
                 <w:szCs w:val="24"/>
               </w:rPr>
+              <w:lastRenderedPageBreak/>
               <w:t>WEEK 7: Team Challenge: Managing Stress</w:t>
             </w:r>
           </w:p>
@@ -8538,7 +8567,6 @@
                 <w:sz w:val="20"/>
                 <w:szCs w:val="20"/>
               </w:rPr>
-              <w:lastRenderedPageBreak/>
               <w:t>Team stress management challenge</w:t>
             </w:r>
           </w:p>
@@ -9586,7 +9614,18 @@
                 <w:sz w:val="20"/>
                 <w:szCs w:val="20"/>
               </w:rPr>
-              <w:t>NOTE FOR INSTRUCTOR: Coordinate your guest speaker in advance. A first responder, veteran, or emergency worker works well. Frame their role as emotional composure under pressure, not heroics.</w:t>
+              <w:t xml:space="preserve">NOTE FOR INSTRUCTOR: Coordinate your guest speaker in advance. A first responder, veteran, or emergency worker works </w:t>
+            </w:r>
+            <w:r>
+              <w:rPr>
+                <w:i/>
+                <w:iCs/>
+                <w:color w:val="333333"/>
+                <w:sz w:val="20"/>
+                <w:szCs w:val="20"/>
+              </w:rPr>
+              <w:lastRenderedPageBreak/>
+              <w:t>well. Frame their role as emotional composure under pressure, not heroics.</w:t>
             </w:r>
           </w:p>
         </w:tc>
@@ -9625,6 +9664,7 @@
                 <w:sz w:val="20"/>
                 <w:szCs w:val="20"/>
               </w:rPr>
+              <w:lastRenderedPageBreak/>
               <w:t>Assign Reflection Journal #8</w:t>
             </w:r>
           </w:p>
@@ -10611,6 +10651,7 @@
                 <w:sz w:val="24"/>
                 <w:szCs w:val="24"/>
               </w:rPr>
+              <w:lastRenderedPageBreak/>
               <w:t>WEEK 10: Scenario Simulations: Online Conversations</w:t>
             </w:r>
           </w:p>
@@ -10718,7 +10759,6 @@
                 <w:sz w:val="20"/>
                 <w:szCs w:val="20"/>
               </w:rPr>
-              <w:lastRenderedPageBreak/>
               <w:t>Digital scenario simulations</w:t>
             </w:r>
           </w:p>
@@ -11705,6 +11745,7 @@
                 <w:sz w:val="20"/>
                 <w:szCs w:val="20"/>
               </w:rPr>
+              <w:lastRenderedPageBreak/>
               <w:t>Peer observation checklists</w:t>
             </w:r>
           </w:p>
@@ -11839,7 +11880,6 @@
                 <w:sz w:val="20"/>
                 <w:szCs w:val="20"/>
               </w:rPr>
-              <w:lastRenderedPageBreak/>
               <w:t>Assign Reflection Journal #11</w:t>
             </w:r>
           </w:p>
@@ -12852,6 +12892,7 @@
                 <w:sz w:val="20"/>
                 <w:szCs w:val="20"/>
               </w:rPr>
+              <w:lastRenderedPageBreak/>
               <w:t>WHAT TO DO</w:t>
             </w:r>
           </w:p>
@@ -13026,18 +13067,7 @@
                 <w:sz w:val="20"/>
                 <w:szCs w:val="20"/>
               </w:rPr>
-              <w:t>Your job in this simulation: regulate first (Pause-Label-Reframe-Respond (PLRR)), then decide (Pause-Options-Consequences-</w:t>
-            </w:r>
-            <w:r>
-              <w:rPr>
-                <w:i/>
-                <w:iCs/>
-                <w:color w:val="333333"/>
-                <w:sz w:val="20"/>
-                <w:szCs w:val="20"/>
-              </w:rPr>
-              <w:lastRenderedPageBreak/>
-              <w:t>Choose (POCC)), then hold yourself accountable if you mess up (Own it - Fix it - Follow Through).</w:t>
+              <w:t>Your job in this simulation: regulate first (Pause-Label-Reframe-Respond (PLRR)), then decide (Pause-Options-Consequences-Choose (POCC)), then hold yourself accountable if you mess up (Own it - Fix it - Follow Through).</w:t>
             </w:r>
           </w:p>
         </w:tc>
@@ -13076,7 +13106,6 @@
                 <w:sz w:val="20"/>
                 <w:szCs w:val="20"/>
               </w:rPr>
-              <w:lastRenderedPageBreak/>
               <w:t>Students apply Pause-Label-Reframe-Respond (PLRR) + Pause-Options-Consequences-Choose (POCC) + accountability model</w:t>
             </w:r>
           </w:p>
@@ -13913,6 +13942,7 @@
                 <w:sz w:val="20"/>
                 <w:szCs w:val="20"/>
               </w:rPr>
+              <w:lastRenderedPageBreak/>
               <w:t>Capstone project work time</w:t>
             </w:r>
           </w:p>
@@ -14107,7 +14137,6 @@
               <w:rPr>
                 <w:color w:val="333333"/>
               </w:rPr>
-              <w:lastRenderedPageBreak/>
               <w:t>Self-Assessment worksheet - kept in workbook, reviewed by instructor</w:t>
             </w:r>
           </w:p>
@@ -15004,6 +15033,7 @@
                 <w:sz w:val="24"/>
                 <w:szCs w:val="24"/>
               </w:rPr>
+              <w:lastRenderedPageBreak/>
               <w:t>WEEK 16: Capstone Presentations &amp; Course Reflections (FINAL WEEK - MILESTONE)</w:t>
             </w:r>
           </w:p>
@@ -15183,7 +15213,6 @@
                 <w:sz w:val="20"/>
                 <w:szCs w:val="20"/>
               </w:rPr>
-              <w:lastRenderedPageBreak/>
               <w:t>Authentic audience present (administrators, community members, or employers if possible)</w:t>
             </w:r>
           </w:p>
@@ -27576,8 +27605,8 @@
       </w:r>
     </w:p>
     <w:sectPr>
-      <w:headerReference w:type="default" r:id="rId16"/>
-      <w:footerReference w:type="default" r:id="rId17"/>
+      <w:headerReference w:type="default" r:id="rId17"/>
+      <w:footerReference w:type="default" r:id="rId18"/>
       <w:pgSz w:w="12240" w:h="15840"/>
       <w:pgMar w:top="1440" w:right="1260" w:bottom="1440" w:left="1260" w:header="708" w:footer="708" w:gutter="0"/>
       <w:cols w:space="720"/>

</xml_diff>